<commit_message>
Week 5 forms: show the evidence rather than only tick it
Both Required Evidence blocks claimed screenshots and contained none. Each
now carries the screenshot it is ticking: the live attendance session under
Activity 2, where the checklist says Running System Screenshot, and the
administrator dashboard under Activity 5's Prototype Screenshots.

Inserted after the existing checklist lines, so nothing already in the
document moved: the header, both CCIT logos and every filled answer are
untouched, and the only new text is the two captions.

Co-Authored-By: Claude Opus 5 <noreply@anthropic.com>
Claude-Session: https://claude.ai/code/session_01Q45fS2BUA9AsMQ6jwBPH9a
</commit_message>
<xml_diff>
--- a/docs/week5/WEEK-5-Accomplished-Forms.docx
+++ b/docs/week5/WEEK-5-Accomplished-Forms.docx
@@ -3486,6 +3486,71 @@
     <w:p>
       <w:pPr>
         <w:spacing w:after="0" w:line="240" w:lineRule="auto"/>
+        <w:ind w:left="720"/>
+        <w:contextualSpacing/>
+        <w:jc w:val="center"/>
+        <w:rPr>
+          <w:rFonts w:ascii="Times New Roman" w:hAnsi="Times New Roman" w:cs="Times New Roman"/>
+        </w:rPr>
+      </w:pPr>
+      <w:r>
+        <w:drawing>
+          <wp:inline xmlns:a="http://schemas.openxmlformats.org/drawingml/2006/main" xmlns:pic="http://schemas.openxmlformats.org/drawingml/2006/picture">
+            <wp:extent cx="5669280" cy="3543300"/>
+            <wp:docPr id="1" name="Picture 1"/>
+            <wp:cNvGraphicFramePr>
+              <a:graphicFrameLocks noChangeAspect="1"/>
+            </wp:cNvGraphicFramePr>
+            <a:graphic>
+              <a:graphicData uri="http://schemas.openxmlformats.org/drawingml/2006/picture">
+                <pic:pic>
+                  <pic:nvPicPr>
+                    <pic:cNvPr id="0" name="03-session-detail.png"/>
+                    <pic:cNvPicPr/>
+                  </pic:nvPicPr>
+                  <pic:blipFill>
+                    <a:blip r:embed="rId10"/>
+                    <a:stretch>
+                      <a:fillRect/>
+                    </a:stretch>
+                  </pic:blipFill>
+                  <pic:spPr>
+                    <a:xfrm>
+                      <a:off x="0" y="0"/>
+                      <a:ext cx="5669280" cy="3543300"/>
+                    </a:xfrm>
+                    <a:prstGeom prst="rect"/>
+                  </pic:spPr>
+                </pic:pic>
+              </a:graphicData>
+            </a:graphic>
+          </wp:inline>
+        </w:drawing>
+      </w:r>
+    </w:p>
+    <w:p>
+      <w:pPr>
+        <w:spacing w:after="0" w:line="240" w:lineRule="auto"/>
+        <w:ind w:left="720"/>
+        <w:contextualSpacing/>
+        <w:jc w:val="center"/>
+        <w:rPr>
+          <w:rFonts w:ascii="Times New Roman" w:hAnsi="Times New Roman" w:cs="Times New Roman"/>
+        </w:rPr>
+      </w:pPr>
+      <w:r>
+        <w:rPr>
+          <w:rFonts w:ascii="Times New Roman" w:hAnsi="Times New Roman"/>
+          <w:i/>
+          <w:color w:val="595959"/>
+          <w:sz w:val="18"/>
+        </w:rPr>
+        <w:t>Running system: attendance session ATT-2026-000102 open on terminal DEMO-DEV-0001, opened by teacher fingerprint. 18 students recorded live, 12 not yet seen. The status pill reads "Live" - the page is on a WebSocket, not a refresh timer.</w:t>
+      </w:r>
+    </w:p>
+    <w:p>
+      <w:pPr>
+        <w:spacing w:after="0" w:line="240" w:lineRule="auto"/>
         <w:contextualSpacing/>
         <w:jc w:val="center"/>
         <w:rPr>
@@ -7572,6 +7637,71 @@
           <w:rFonts w:ascii="Times New Roman" w:hAnsi="Times New Roman" w:cs="Times New Roman"/>
         </w:rPr>
         <w:t>☑ Prototype Screenshots</w:t>
+      </w:r>
+    </w:p>
+    <w:p>
+      <w:pPr>
+        <w:spacing w:after="0" w:line="240" w:lineRule="auto"/>
+        <w:ind w:left="720"/>
+        <w:contextualSpacing/>
+        <w:jc w:val="center"/>
+        <w:rPr>
+          <w:rFonts w:ascii="Times New Roman" w:hAnsi="Times New Roman" w:cs="Times New Roman"/>
+        </w:rPr>
+      </w:pPr>
+      <w:r>
+        <w:drawing>
+          <wp:inline xmlns:a="http://schemas.openxmlformats.org/drawingml/2006/main" xmlns:pic="http://schemas.openxmlformats.org/drawingml/2006/picture">
+            <wp:extent cx="5669280" cy="3543300"/>
+            <wp:docPr id="2" name="Picture 2"/>
+            <wp:cNvGraphicFramePr>
+              <a:graphicFrameLocks noChangeAspect="1"/>
+            </wp:cNvGraphicFramePr>
+            <a:graphic>
+              <a:graphicData uri="http://schemas.openxmlformats.org/drawingml/2006/picture">
+                <pic:pic>
+                  <pic:nvPicPr>
+                    <pic:cNvPr id="0" name="02-dashboard.png"/>
+                    <pic:cNvPicPr/>
+                  </pic:nvPicPr>
+                  <pic:blipFill>
+                    <a:blip r:embed="rId11"/>
+                    <a:stretch>
+                      <a:fillRect/>
+                    </a:stretch>
+                  </pic:blipFill>
+                  <pic:spPr>
+                    <a:xfrm>
+                      <a:off x="0" y="0"/>
+                      <a:ext cx="5669280" cy="3543300"/>
+                    </a:xfrm>
+                    <a:prstGeom prst="rect"/>
+                  </pic:spPr>
+                </pic:pic>
+              </a:graphicData>
+            </a:graphic>
+          </wp:inline>
+        </w:drawing>
+      </w:r>
+    </w:p>
+    <w:p>
+      <w:pPr>
+        <w:spacing w:after="0" w:line="240" w:lineRule="auto"/>
+        <w:ind w:left="720"/>
+        <w:contextualSpacing/>
+        <w:jc w:val="center"/>
+        <w:rPr>
+          <w:rFonts w:ascii="Times New Roman" w:hAnsi="Times New Roman" w:cs="Times New Roman"/>
+        </w:rPr>
+      </w:pPr>
+      <w:r>
+        <w:rPr>
+          <w:rFonts w:ascii="Times New Roman" w:hAnsi="Times New Roman"/>
+          <w:i/>
+          <w:color w:val="595959"/>
+          <w:sz w:val="18"/>
+        </w:rPr>
+        <w:t>Prototype screenshot: administrator dashboard showing live counts - 131 students, 7 teachers, 5 of 5 terminals online - drawn from the seeded demonstration school.</w:t>
       </w:r>
     </w:p>
     <w:p>

</xml_diff>